<commit_message>
docs: update v8 SQL, Word doc, and sync BUILDING.md for query optimizations
- v8.sql: five optimizations applied (filter in CTE, BlockType index,
  ApprovalGroupLookup pre-materialisation, sargable ContactGroup JOIN,
  WorkflowDefinitionRecID index on #Blocks)
- generate_doc_v8.py + Word doc: updated How It Works section and
  Changes table to document all eight changes from v7 to v8

Co-Authored-By: Claude Sonnet 4.6 <noreply@anthropic.com>
</commit_message>
<xml_diff>
--- a/SQL/FindTeamByBlockTypeAndWorkflow_v8_Documentation.docx
+++ b/SQL/FindTeamByBlockTypeAndWorkflow_v8_Documentation.docx
@@ -679,7 +679,7 @@
     </w:p>
     <w:p>
       <w:r>
-        <w:t>A CTE (LatestVersions) uses ROW_NUMBER() partitioned by WorkflowTypeLink_RecID to identify the most recent version of each workflow. WITH (NOLOCK) is applied to all base table reads — this is a read-only reporting query and NOLOCK prevents blocking the live Ivanti system. The workflow XML is cleaned of its declaration and namespace prefix, cast to the XML data type, and stored with a UPPER()-normalised RecID. A clustered index on WorkflowDefinitionRecID is created after population.</w:t>
+        <w:t>The LatestVersions CTE now includes the JOIN to frs_def_workflow_type and the %form / name filters — ROW_NUMBER() only runs over matching workflows, not the entire definition table. WITH (NOLOCK) on all base table reads prevents blocking the live Ivanti system. The workflow XML is cleaned of its declaration and namespace prefix, cast to the XML data type, and stored with a UPPER()-normalised RecID. A clustered index on WorkflowDefinitionRecID is created after population.</w:t>
       </w:r>
     </w:p>
     <w:p>
@@ -692,7 +692,7 @@
     </w:p>
     <w:p>
       <w:r>
-        <w:t>All workflow XML is shredded into one row per block in a single pass using CROSS APPLY ... .nodes(). The block XML fragment is stored alongside title and type. DISTINCT is intentionally omitted — the XML type is not comparable in SQL Server, so DISTINCT on an XML column would error. Deduplication is handled in the PATH steps which do not carry the XML column forward.</w:t>
+        <w:t>All workflow XML is shredded into one row per block in a single pass using CROSS APPLY ... .nodes(). The block XML fragment is stored alongside title and type. DISTINCT is intentionally omitted — the XML type is not comparable in SQL Server, so DISTINCT on an XML column would error. Deduplication is handled in the PATH steps which do not carry the XML column forward. Two indexes are created: a clustered index on WorkflowDefinitionRecID and a non-clustered index on BlockType so PATH 3 can seek directly to vote0007/vote rows without scanning the full table.</w:t>
       </w:r>
     </w:p>
     <w:p>
@@ -731,7 +731,9 @@
         <w:br/>
         <w:t>CROSS APPLY ab.BlockXml.nodes('block/blockProperties/property[name="QuickAction"]') q(qaprop);</w:t>
         <w:br/>
-        <w:t>CREATE CLUSTERED INDEX IX_Blocks_QAID ON #Blocks (QAID);</w:t>
+        <w:t>CREATE CLUSTERED INDEX    IX_Blocks_QAID  ON #Blocks (QAID);</w:t>
+        <w:br/>
+        <w:t>CREATE NONCLUSTERED INDEX IX_Blocks_RecID ON #Blocks (WorkflowDefinitionRecID);</w:t>
       </w:r>
     </w:p>
     <w:p>
@@ -752,12 +754,12 @@
         <w:pStyle w:val="Heading2"/>
       </w:pPr>
       <w:r>
-        <w:t>PATH 3 — Approval Blocks  (#ApprovalBlocks)  [new in v8]</w:t>
+        <w:t>Pre-stage — Approval Group Lookup  (#ApprovalGroupLookup)</w:t>
       </w:r>
     </w:p>
     <w:p>
       <w:r>
-        <w:t>Extracts vote0007 and vote approval blocks. The approver contact group GUID is read from the approvers/groups/group XML path, then joined to the ContactGroup table to resolve the GUID to a group name. Only static group assignments (where a GUID is present) are included; dynamic approvers (_unchecked, from field, from profile) produce no GUID and are excluded by the JOIN.</w:t>
+        <w:t>Before PATH 3, active Service Request Approval contact groups are pre-materialised into #ApprovalGroupLookup with a clustered index on RecId. This avoids PATH 3 scanning the full ContactGroup table on every query.</w:t>
       </w:r>
     </w:p>
     <w:p>
@@ -771,15 +773,46 @@
           <w:color w:val="1E407C"/>
           <w:sz w:val="18"/>
         </w:rPr>
-        <w:t>CROSS APPLY ab.BlockXml.nodes('block/blockProperties/property[name="approvers"]/groups/group') g(grp)</w:t>
+        <w:t>SELECT RecId, Name INTO #ApprovalGroupLookup</w:t>
         <w:br/>
+        <w:t>FROM ContactGroup WITH (NOLOCK)</w:t>
+        <w:br/>
+        <w:t>WHERE Status = 'Active' AND GroupType = 'Service Request Approval';</w:t>
+        <w:br/>
+        <w:t>CREATE CLUSTERED INDEX IX_AGL_RecId ON #ApprovalGroupLookup (RecId);</w:t>
+      </w:r>
+    </w:p>
+    <w:p>
+      <w:pPr>
+        <w:pStyle w:val="Heading2"/>
+      </w:pPr>
+      <w:r>
+        <w:t>PATH 3 — Approval Blocks  (#ApprovalBlocks)</w:t>
+      </w:r>
+    </w:p>
+    <w:p>
+      <w:r>
+        <w:t>Extracts vote0007 and vote approval blocks. The approver contact group GUID is read from the approvers/groups/group XML path, then joined to #ApprovalGroupLookup to resolve the GUID to a group name. UPPER() is applied to the XML-extracted value (casing not guaranteed) but removed from the JOIN column so the clustered index on RecId is sargable on CI collations. Only static group assignments (where a GUID is present) are included; dynamic approvers produce no GUID and are excluded by the JOIN.</w:t>
+      </w:r>
+    </w:p>
+    <w:p>
+      <w:pPr>
+        <w:ind w:left="576"/>
+        <w:shd w:val="clear" w:color="auto" w:fill="EEF2F8"/>
+      </w:pPr>
+      <w:r>
+        <w:rPr>
+          <w:rFonts w:ascii="Courier New" w:hAnsi="Courier New"/>
+          <w:color w:val="1E407C"/>
+          <w:sz w:val="18"/>
+        </w:rPr>
         <w:t>CROSS APPLY (VALUES (</w:t>
         <w:br/>
         <w:t xml:space="preserve">    UPPER(LTRIM(RTRIM(g.grp.value('(param[name="contactgroup"]/value)[1]', 'nvarchar(50)'))))</w:t>
         <w:br/>
         <w:t>)) av (ContactGroupId)</w:t>
         <w:br/>
-        <w:t>JOIN ContactGroup cg WITH (NOLOCK) ON UPPER(cg.RecId) = av.ContactGroupId</w:t>
+        <w:t>JOIN #ApprovalGroupLookup cg ON cg.RecId = av.ContactGroupId</w:t>
         <w:br/>
         <w:t>WHERE ab.BlockType IN ('vote0007', 'vote') AND av.ContactGroupId &lt;&gt; '';</w:t>
       </w:r>
@@ -831,7 +864,7 @@
         <w:pStyle w:val="ListBullet"/>
       </w:pPr>
       <w:r>
-        <w:t>#ApprovalBlocks branch (PATH 3): group name already resolved via ContactGroup JOIN.</w:t>
+        <w:t>#ApprovalBlocks branch (PATH 3): group name already resolved via #ApprovalGroupLookup JOIN.</w:t>
       </w:r>
     </w:p>
     <w:p>
@@ -1038,6 +1071,216 @@
           <w:p>
             <w:r>
               <w:t>No orphaned temp tables if the script is run multiple times in the same session</w:t>
+            </w:r>
+          </w:p>
+        </w:tc>
+      </w:tr>
+      <w:tr>
+        <w:tc>
+          <w:tcPr>
+            <w:tcW w:type="dxa" w:w="2160"/>
+          </w:tcPr>
+          <w:p>
+            <w:r>
+              <w:t>4</w:t>
+            </w:r>
+          </w:p>
+        </w:tc>
+        <w:tc>
+          <w:tcPr>
+            <w:tcW w:type="dxa" w:w="2160"/>
+          </w:tcPr>
+          <w:p>
+            <w:r>
+              <w:t>Filter pushed into LatestVersions CTE — JOIN to frs_def_workflow_type and %form name filter now inside the CTE</w:t>
+            </w:r>
+          </w:p>
+        </w:tc>
+        <w:tc>
+          <w:tcPr>
+            <w:tcW w:type="dxa" w:w="2160"/>
+          </w:tcPr>
+          <w:p>
+            <w:r>
+              <w:t>ROW_NUMBER() was running over the entire definition table before filtering</w:t>
+            </w:r>
+          </w:p>
+        </w:tc>
+        <w:tc>
+          <w:tcPr>
+            <w:tcW w:type="dxa" w:w="2160"/>
+          </w:tcPr>
+          <w:p>
+            <w:r>
+              <w:t>ROW_NUMBER() now only runs over matching *form workflows</w:t>
+            </w:r>
+          </w:p>
+        </w:tc>
+      </w:tr>
+      <w:tr>
+        <w:tc>
+          <w:tcPr>
+            <w:tcW w:type="dxa" w:w="2160"/>
+          </w:tcPr>
+          <w:p>
+            <w:r>
+              <w:t>5</w:t>
+            </w:r>
+          </w:p>
+        </w:tc>
+        <w:tc>
+          <w:tcPr>
+            <w:tcW w:type="dxa" w:w="2160"/>
+          </w:tcPr>
+          <w:p>
+            <w:r>
+              <w:t>Non-clustered index on #AllBlocks(BlockType)</w:t>
+            </w:r>
+          </w:p>
+        </w:tc>
+        <w:tc>
+          <w:tcPr>
+            <w:tcW w:type="dxa" w:w="2160"/>
+          </w:tcPr>
+          <w:p>
+            <w:r>
+              <w:t>PATH 3 was doing a full scan of #AllBlocks to find vote0007/vote rows</w:t>
+            </w:r>
+          </w:p>
+        </w:tc>
+        <w:tc>
+          <w:tcPr>
+            <w:tcW w:type="dxa" w:w="2160"/>
+          </w:tcPr>
+          <w:p>
+            <w:r>
+              <w:t>PATH 3 can now seek directly to the relevant rows</w:t>
+            </w:r>
+          </w:p>
+        </w:tc>
+      </w:tr>
+      <w:tr>
+        <w:tc>
+          <w:tcPr>
+            <w:tcW w:type="dxa" w:w="2160"/>
+          </w:tcPr>
+          <w:p>
+            <w:r>
+              <w:t>6</w:t>
+            </w:r>
+          </w:p>
+        </w:tc>
+        <w:tc>
+          <w:tcPr>
+            <w:tcW w:type="dxa" w:w="2160"/>
+          </w:tcPr>
+          <w:p>
+            <w:r>
+              <w:t>#ApprovalGroupLookup pre-materialises active Service Request Approval groups before PATH 3</w:t>
+            </w:r>
+          </w:p>
+        </w:tc>
+        <w:tc>
+          <w:tcPr>
+            <w:tcW w:type="dxa" w:w="2160"/>
+          </w:tcPr>
+          <w:p>
+            <w:r>
+              <w:t>PATH 3 was joining the full ContactGroup table on every execution</w:t>
+            </w:r>
+          </w:p>
+        </w:tc>
+        <w:tc>
+          <w:tcPr>
+            <w:tcW w:type="dxa" w:w="2160"/>
+          </w:tcPr>
+          <w:p>
+            <w:r>
+              <w:t>PATH 3 joins a small indexed temp table instead</w:t>
+            </w:r>
+          </w:p>
+        </w:tc>
+      </w:tr>
+      <w:tr>
+        <w:tc>
+          <w:tcPr>
+            <w:tcW w:type="dxa" w:w="2160"/>
+          </w:tcPr>
+          <w:p>
+            <w:r>
+              <w:t>7</w:t>
+            </w:r>
+          </w:p>
+        </w:tc>
+        <w:tc>
+          <w:tcPr>
+            <w:tcW w:type="dxa" w:w="2160"/>
+          </w:tcPr>
+          <w:p>
+            <w:r>
+              <w:t>UPPER() removed from the JOIN column in PATH 3 (cg.RecId)</w:t>
+            </w:r>
+          </w:p>
+        </w:tc>
+        <w:tc>
+          <w:tcPr>
+            <w:tcW w:type="dxa" w:w="2160"/>
+          </w:tcPr>
+          <w:p>
+            <w:r>
+              <w:t>UPPER() on an indexed column prevents the index from being used (not sargable)</w:t>
+            </w:r>
+          </w:p>
+        </w:tc>
+        <w:tc>
+          <w:tcPr>
+            <w:tcW w:type="dxa" w:w="2160"/>
+          </w:tcPr>
+          <w:p>
+            <w:r>
+              <w:t>On CI collations the clustered index on RecId is now usable for the JOIN</w:t>
+            </w:r>
+          </w:p>
+        </w:tc>
+      </w:tr>
+      <w:tr>
+        <w:tc>
+          <w:tcPr>
+            <w:tcW w:type="dxa" w:w="2160"/>
+          </w:tcPr>
+          <w:p>
+            <w:r>
+              <w:t>8</w:t>
+            </w:r>
+          </w:p>
+        </w:tc>
+        <w:tc>
+          <w:tcPr>
+            <w:tcW w:type="dxa" w:w="2160"/>
+          </w:tcPr>
+          <w:p>
+            <w:r>
+              <w:t>Non-clustered index on #Blocks(WorkflowDefinitionRecID)</w:t>
+            </w:r>
+          </w:p>
+        </w:tc>
+        <w:tc>
+          <w:tcPr>
+            <w:tcW w:type="dxa" w:w="2160"/>
+          </w:tcPr>
+          <w:p>
+            <w:r>
+              <w:t>The final LEFT JOIN to #WorkflowOffering in PATH 1 had no index support on the #Blocks side</w:t>
+            </w:r>
+          </w:p>
+        </w:tc>
+        <w:tc>
+          <w:tcPr>
+            <w:tcW w:type="dxa" w:w="2160"/>
+          </w:tcPr>
+          <w:p>
+            <w:r>
+              <w:t>Faster LEFT JOIN in the final SELECT</w:t>
             </w:r>
           </w:p>
         </w:tc>

</xml_diff>

<commit_message>
docs: update for No Offering exclusion
SQL/README.md: RequestOfferingStatus output column updated — no longer
mentions 'No Offering', notes that unlinked workflows are excluded.
v8.sql: status filter updated to wo.Status IS NOT NULL on all branches.
generate_doc_v8.py + Word doc: output column and Status filter
descriptions updated to reflect Published/Design only behaviour.
workflow-query-app/README.md: synced from app repo.

Co-Authored-By: Claude Sonnet 4.6 <noreply@anthropic.com>
</commit_message>
<xml_diff>
--- a/SQL/FindTeamByBlockTypeAndWorkflow_v8_Documentation.docx
+++ b/SQL/FindTeamByBlockTypeAndWorkflow_v8_Documentation.docx
@@ -1626,7 +1626,7 @@
           </w:tcPr>
           <w:p>
             <w:r>
-              <w:t>Status of the associated request offering, or "No Offering" if unlinked</w:t>
+              <w:t>Status of the associated request offering (Published or Design). Workflows not linked to a request offering are excluded from results.</w:t>
             </w:r>
           </w:p>
         </w:tc>
@@ -2297,7 +2297,7 @@
         <w:pStyle w:val="ListBullet"/>
       </w:pPr>
       <w:r>
-        <w:t>Status: Dropdown — All statuses, Published, Design.</w:t>
+        <w:t>Status: Dropdown — All statuses (Published + Design), Published only, Design only. Workflows not linked to a request offering are always excluded.</w:t>
       </w:r>
     </w:p>
     <w:p>

</xml_diff>